<commit_message>
Agregar evidencia de subida a GitHub
</commit_message>
<xml_diff>
--- a/Actividad_Semana_5_OCP.docx
+++ b/Actividad_Semana_5_OCP.docx
@@ -436,6 +436,58 @@
           <w:sz w:val="22"/>
         </w:rPr>
         <w:t xml:space="preserve">Crear DescuentoMayorista que implemente IDescuentoStrategy y registrar: DescuentoFactory.registrar("MAYORISTA", new DescuentoMayorista()). El servicio central permanece igual.</w:t>
+      </w:r>
+    </w:p>
+    <w:p>
+      <w:r>
+        <w:rPr>
+          <w:b/>
+          <w:sz w:val="28"/>
+        </w:rPr>
+        <w:t>Actualización: evidencia de subida pública exitosa</w:t>
+      </w:r>
+    </w:p>
+    <w:p>
+      <w:r>
+        <w:rPr>
+          <w:sz w:val="22"/>
+        </w:rPr>
+        <w:t>Se creó el repositorio público y se realizó git push -u origin main correctamente. La terminal confirma que la rama main fue creada en origin/main.</w:t>
+      </w:r>
+    </w:p>
+    <w:p>
+      <w:r>
+        <w:drawing>
+          <wp:inline distT="0" distB="0" distL="0" distR="0">
+            <wp:extent cx="5943600" cy="3343275"/>
+            <wp:docPr id="6" name="Evidencia Git Push"/>
+            <a:graphic>
+              <a:graphicData uri="http://schemas.openxmlformats.org/drawingml/2006/picture">
+                <pic:pic>
+                  <pic:nvPicPr>
+                    <pic:cNvPr id="0" name="git-push.png"/>
+                    <pic:cNvPicPr/>
+                  </pic:nvPicPr>
+                  <pic:blipFill>
+                    <a:blip r:embed="rId6"/>
+                    <a:stretch>
+                      <a:fillRect/>
+                    </a:stretch>
+                  </pic:blipFill>
+                  <pic:spPr>
+                    <a:xfrm>
+                      <a:off x="0" y="0"/>
+                      <a:ext cx="5943600" cy="3343275"/>
+                    </a:xfrm>
+                    <a:prstGeom prst="rect">
+                      <a:avLst/>
+                    </a:prstGeom>
+                  </pic:spPr>
+                </pic:pic>
+              </a:graphicData>
+            </a:graphic>
+          </wp:inline>
+        </w:drawing>
       </w:r>
     </w:p>
     <w:sectPr>

</xml_diff>

<commit_message>
Ajustar evidencia de Git en el documento
</commit_message>
<xml_diff>
--- a/Actividad_Semana_5_OCP.docx
+++ b/Actividad_Semana_5_OCP.docx
@@ -3,9 +3,6 @@
 <w:document xmlns:w="http://schemas.openxmlformats.org/wordprocessingml/2006/main" xmlns:r="http://schemas.openxmlformats.org/officeDocument/2006/relationships" xmlns:wp="http://schemas.openxmlformats.org/drawingml/2006/wordprocessingDrawing" xmlns:a="http://schemas.openxmlformats.org/drawingml/2006/main" xmlns:pic="http://schemas.openxmlformats.org/drawingml/2006/picture">
   <w:body>
     <w:p>
-      <w:pPr>
-        <w:jc w:val="center"/>
-      </w:pPr>
       <w:r>
         <w:rPr>
           <w:b/>
@@ -15,9 +12,6 @@
       </w:r>
     </w:p>
     <w:p>
-      <w:pPr>
-        <w:jc w:val="center"/>
-      </w:pPr>
       <w:r>
         <w:rPr>
           <w:b/>
@@ -27,9 +21,6 @@
       </w:r>
     </w:p>
     <w:p>
-      <w:pPr>
-        <w:jc w:val="center"/>
-      </w:pPr>
       <w:r>
         <w:rPr>
           <w:sz w:val="22"/>
@@ -38,35 +29,6 @@
       </w:r>
     </w:p>
     <w:p>
-      <w:pPr/>
-      <w:r>
-        <w:rPr>
-          <w:sz w:val="22"/>
-        </w:rPr>
-        <w:t xml:space="preserve"/>
-      </w:r>
-    </w:p>
-    <w:p>
-      <w:pPr/>
-      <w:r>
-        <w:rPr>
-          <w:b/>
-          <w:sz w:val="28"/>
-        </w:rPr>
-        <w:t xml:space="preserve">Objetivo</w:t>
-      </w:r>
-    </w:p>
-    <w:p>
-      <w:pPr/>
-      <w:r>
-        <w:rPr>
-          <w:sz w:val="22"/>
-        </w:rPr>
-        <w:t xml:space="preserve">Aplicar Strategy y Factory para calcular descuentos sin un bloque condicional extenso. Las reglas se pueden extender sin modificar el servicio central.</w:t>
-      </w:r>
-    </w:p>
-    <w:p>
-      <w:pPr/>
       <w:r>
         <w:rPr>
           <w:b/>
@@ -76,20 +38,19 @@
       </w:r>
     </w:p>
     <w:p>
-      <w:pPr/>
-      <w:r>
-        <w:rPr>
-          <w:sz w:val="22"/>
-        </w:rPr>
-        <w:t xml:space="preserve">La interfaz define el contrato aplicar(monto) que cumplen todas las estrategias.</w:t>
-      </w:r>
-    </w:p>
-    <w:p>
-      <w:r>
-        <w:drawing>
-          <wp:inline distT="0" distB="0" distL="0" distR="0">
-            <wp:extent cx="5943600" cy="3343275"/>
-            <wp:docPr id="1" name="Evidencia 1"/>
+      <w:r>
+        <w:rPr>
+          <w:sz w:val="22"/>
+        </w:rPr>
+        <w:t xml:space="preserve">La interfaz define el contrato aplicar(monto) para todas las estrategias.</w:t>
+      </w:r>
+    </w:p>
+    <w:p>
+      <w:r>
+        <w:drawing>
+          <wp:inline distT="0" distB="0" distL="0" distR="0">
+            <wp:extent cx="5943600" cy="3343275"/>
+            <wp:docPr id="1" name="Evidencia"/>
             <a:graphic>
               <a:graphicData uri="http://schemas.openxmlformats.org/drawingml/2006/picture">
                 <pic:pic>
@@ -120,7 +81,6 @@
       </w:r>
     </w:p>
     <w:p>
-      <w:pPr/>
       <w:r>
         <w:rPr>
           <w:b/>
@@ -130,7 +90,6 @@
       </w:r>
     </w:p>
     <w:p>
-      <w:pPr/>
       <w:r>
         <w:rPr>
           <w:sz w:val="22"/>
@@ -139,7 +98,6 @@
       </w:r>
     </w:p>
     <w:p>
-      <w:pPr/>
       <w:r>
         <w:rPr>
           <w:b/>
@@ -149,20 +107,19 @@
       </w:r>
     </w:p>
     <w:p>
-      <w:pPr/>
-      <w:r>
-        <w:rPr>
-          <w:sz w:val="22"/>
-        </w:rPr>
-        <w:t xml:space="preserve">La Factory registra las estrategias en un Map, las obtiene por tipo de cliente y evita un if-else gigante.</w:t>
-      </w:r>
-    </w:p>
-    <w:p>
-      <w:r>
-        <w:drawing>
-          <wp:inline distT="0" distB="0" distL="0" distR="0">
-            <wp:extent cx="5943600" cy="3343275"/>
-            <wp:docPr id="2" name="Evidencia 2"/>
+      <w:r>
+        <w:rPr>
+          <w:sz w:val="22"/>
+        </w:rPr>
+        <w:t xml:space="preserve">La Factory registra las estrategias en un Map y evita un if-else gigante.</w:t>
+      </w:r>
+    </w:p>
+    <w:p>
+      <w:r>
+        <w:drawing>
+          <wp:inline distT="0" distB="0" distL="0" distR="0">
+            <wp:extent cx="5943600" cy="3343275"/>
+            <wp:docPr id="2" name="Evidencia"/>
             <a:graphic>
               <a:graphicData uri="http://schemas.openxmlformats.org/drawingml/2006/picture">
                 <pic:pic>
@@ -193,7 +150,6 @@
       </w:r>
     </w:p>
     <w:p>
-      <w:pPr/>
       <w:r>
         <w:rPr>
           <w:b/>
@@ -203,20 +159,19 @@
       </w:r>
     </w:p>
     <w:p>
-      <w:pPr/>
-      <w:r>
-        <w:rPr>
-          <w:sz w:val="22"/>
-        </w:rPr>
-        <w:t xml:space="preserve">DescuentoService delega a Factory + Strategy. VentaService calcula y guarda el descuento; el reporte muestra subtotal, descuento y total a pagar.</w:t>
-      </w:r>
-    </w:p>
-    <w:p>
-      <w:r>
-        <w:drawing>
-          <wp:inline distT="0" distB="0" distL="0" distR="0">
-            <wp:extent cx="5943600" cy="3343275"/>
-            <wp:docPr id="3" name="Evidencia 3"/>
+      <w:r>
+        <w:rPr>
+          <w:sz w:val="22"/>
+        </w:rPr>
+        <w:t xml:space="preserve">DescuentoService utiliza Factory + Strategy. VentaService aplica y guarda el descuento al finalizar cada venta.</w:t>
+      </w:r>
+    </w:p>
+    <w:p>
+      <w:r>
+        <w:drawing>
+          <wp:inline distT="0" distB="0" distL="0" distR="0">
+            <wp:extent cx="5943600" cy="3343275"/>
+            <wp:docPr id="3" name="Evidencia"/>
             <a:graphic>
               <a:graphicData uri="http://schemas.openxmlformats.org/drawingml/2006/picture">
                 <pic:pic>
@@ -251,7 +206,7 @@
         <w:drawing>
           <wp:inline distT="0" distB="0" distL="0" distR="0">
             <wp:extent cx="5943600" cy="3343275"/>
-            <wp:docPr id="4" name="Evidencia 4"/>
+            <wp:docPr id="4" name="Evidencia"/>
             <a:graphic>
               <a:graphicData uri="http://schemas.openxmlformats.org/drawingml/2006/picture">
                 <pic:pic>
@@ -282,7 +237,6 @@
       </w:r>
     </w:p>
     <w:p>
-      <w:pPr/>
       <w:r>
         <w:rPr>
           <w:b/>
@@ -292,20 +246,19 @@
       </w:r>
     </w:p>
     <w:p>
-      <w:pPr/>
-      <w:r>
-        <w:rPr>
-          <w:sz w:val="22"/>
-        </w:rPr>
-        <w:t xml:space="preserve">El sistema se compiló y ejecutó con Eclipse Temurin JDK 21. La evidencia muestra desde el registro de clientes hasta el reporte final de cuatro ventas con descuentos correctos.</w:t>
-      </w:r>
-    </w:p>
-    <w:p>
-      <w:r>
-        <w:drawing>
-          <wp:inline distT="0" distB="0" distL="0" distR="0">
-            <wp:extent cx="5943600" cy="3343275"/>
-            <wp:docPr id="5" name="Evidencia 5"/>
+      <w:r>
+        <w:rPr>
+          <w:sz w:val="22"/>
+        </w:rPr>
+        <w:t xml:space="preserve">El sistema se compiló y ejecutó con JDK 21. Se verificaron las ventas VIP, Empresa, Estudiante y Normal desde el registro de clientes hasta el reporte final.</w:t>
+      </w:r>
+    </w:p>
+    <w:p>
+      <w:r>
+        <w:drawing>
+          <wp:inline distT="0" distB="0" distL="0" distR="0">
+            <wp:extent cx="5943600" cy="3343275"/>
+            <wp:docPr id="5" name="Evidencia"/>
             <a:graphic>
               <a:graphicData uri="http://schemas.openxmlformats.org/drawingml/2006/picture">
                 <pic:pic>
@@ -336,7 +289,6 @@
       </w:r>
     </w:p>
     <w:p>
-      <w:pPr/>
       <w:r>
         <w:rPr>
           <w:b/>
@@ -346,16 +298,14 @@
       </w:r>
     </w:p>
     <w:p>
-      <w:pPr/>
-      <w:r>
-        <w:rPr>
-          <w:sz w:val="22"/>
-        </w:rPr>
-        <w:t xml:space="preserve">Pendiente de realizar por el estudiante. Antes de hacerlo debe resolverse el conflicto existente en README.md. Luego ejecutar:</w:t>
-      </w:r>
-    </w:p>
-    <w:p>
-      <w:pPr/>
+      <w:r>
+        <w:rPr>
+          <w:sz w:val="22"/>
+        </w:rPr>
+        <w:t xml:space="preserve">Comandos ejecutados en la terminal:</w:t>
+      </w:r>
+    </w:p>
+    <w:p>
       <w:r>
         <w:rPr>
           <w:sz w:val="20"/>
@@ -364,7 +314,6 @@
       </w:r>
     </w:p>
     <w:p>
-      <w:pPr/>
       <w:r>
         <w:rPr>
           <w:sz w:val="20"/>
@@ -373,25 +322,57 @@
       </w:r>
     </w:p>
     <w:p>
-      <w:pPr/>
       <w:r>
         <w:rPr>
           <w:sz w:val="20"/>
         </w:rPr>
-        <w:t xml:space="preserve">git push</w:t>
-      </w:r>
-    </w:p>
-    <w:p>
-      <w:pPr/>
-      <w:r>
-        <w:rPr>
-          <w:sz w:val="22"/>
-        </w:rPr>
-        <w:t xml:space="preserve">Después de la subida, insertar una captura de la terminal mostrando el push exitoso o del repositorio GitHub con el commit publicado.</w:t>
-      </w:r>
-    </w:p>
-    <w:p>
-      <w:pPr/>
+        <w:t xml:space="preserve">git push -u origin main</w:t>
+      </w:r>
+    </w:p>
+    <w:p>
+      <w:r>
+        <w:rPr>
+          <w:sz w:val="22"/>
+        </w:rPr>
+        <w:t xml:space="preserve">Evidencia de los comandos ejecutados:</w:t>
+      </w:r>
+    </w:p>
+    <w:p>
+      <w:r>
+        <w:drawing>
+          <wp:inline distT="0" distB="0" distL="0" distR="0">
+            <wp:extent cx="5943600" cy="3343275"/>
+            <wp:docPr id="6" name="Evidencia"/>
+            <a:graphic>
+              <a:graphicData uri="http://schemas.openxmlformats.org/drawingml/2006/picture">
+                <pic:pic>
+                  <pic:nvPicPr>
+                    <pic:cNvPr id="0" name="evidencia.png"/>
+                    <pic:cNvPicPr/>
+                  </pic:nvPicPr>
+                  <pic:blipFill>
+                    <a:blip r:embed="rId6"/>
+                    <a:stretch>
+                      <a:fillRect/>
+                    </a:stretch>
+                  </pic:blipFill>
+                  <pic:spPr>
+                    <a:xfrm>
+                      <a:off x="0" y="0"/>
+                      <a:ext cx="5943600" cy="3343275"/>
+                    </a:xfrm>
+                    <a:prstGeom prst="rect">
+                      <a:avLst/>
+                    </a:prstGeom>
+                  </pic:spPr>
+                </pic:pic>
+              </a:graphicData>
+            </a:graphic>
+          </wp:inline>
+        </w:drawing>
+      </w:r>
+    </w:p>
+    <w:p>
       <w:r>
         <w:rPr>
           <w:b/>
@@ -401,7 +382,6 @@
       </w:r>
     </w:p>
     <w:p>
-      <w:pPr/>
       <w:r>
         <w:rPr>
           <w:b/>
@@ -411,83 +391,28 @@
       </w:r>
     </w:p>
     <w:p>
-      <w:pPr/>
-      <w:r>
-        <w:rPr>
-          <w:sz w:val="22"/>
-        </w:rPr>
-        <w:t xml:space="preserve">Porque cada regla se encapsula en una clase independiente. Agregar una nueva regla no altera VentaService ni DescuentoService ya probados, por lo que disminuye regresiones.</w:t>
-      </w:r>
-    </w:p>
-    <w:p>
-      <w:pPr/>
+      <w:r>
+        <w:rPr>
+          <w:sz w:val="22"/>
+        </w:rPr>
+        <w:t xml:space="preserve">Porque cada regla se encuentra en una clase independiente. Agregar un descuento no cambia VentaService ni DescuentoService ya probados y reduce regresiones.</w:t>
+      </w:r>
+    </w:p>
+    <w:p>
       <w:r>
         <w:rPr>
           <w:b/>
           <w:sz w:val="24"/>
         </w:rPr>
-        <w:t xml:space="preserve">Ejemplo de un nuevo descuento sin modificar código existente</w:t>
-      </w:r>
-    </w:p>
-    <w:p>
-      <w:pPr/>
+        <w:t xml:space="preserve">Ejemplo de nuevo descuento</w:t>
+      </w:r>
+    </w:p>
+    <w:p>
       <w:r>
         <w:rPr>
           <w:sz w:val="22"/>
         </w:rPr>
         <w:t xml:space="preserve">Crear DescuentoMayorista que implemente IDescuentoStrategy y registrar: DescuentoFactory.registrar("MAYORISTA", new DescuentoMayorista()). El servicio central permanece igual.</w:t>
-      </w:r>
-    </w:p>
-    <w:p>
-      <w:r>
-        <w:rPr>
-          <w:b/>
-          <w:sz w:val="28"/>
-        </w:rPr>
-        <w:t>Actualización: evidencia de subida pública exitosa</w:t>
-      </w:r>
-    </w:p>
-    <w:p>
-      <w:r>
-        <w:rPr>
-          <w:sz w:val="22"/>
-        </w:rPr>
-        <w:t>Se creó el repositorio público y se realizó git push -u origin main correctamente. La terminal confirma que la rama main fue creada en origin/main.</w:t>
-      </w:r>
-    </w:p>
-    <w:p>
-      <w:r>
-        <w:drawing>
-          <wp:inline distT="0" distB="0" distL="0" distR="0">
-            <wp:extent cx="5943600" cy="3343275"/>
-            <wp:docPr id="6" name="Evidencia Git Push"/>
-            <a:graphic>
-              <a:graphicData uri="http://schemas.openxmlformats.org/drawingml/2006/picture">
-                <pic:pic>
-                  <pic:nvPicPr>
-                    <pic:cNvPr id="0" name="git-push.png"/>
-                    <pic:cNvPicPr/>
-                  </pic:nvPicPr>
-                  <pic:blipFill>
-                    <a:blip r:embed="rId6"/>
-                    <a:stretch>
-                      <a:fillRect/>
-                    </a:stretch>
-                  </pic:blipFill>
-                  <pic:spPr>
-                    <a:xfrm>
-                      <a:off x="0" y="0"/>
-                      <a:ext cx="5943600" cy="3343275"/>
-                    </a:xfrm>
-                    <a:prstGeom prst="rect">
-                      <a:avLst/>
-                    </a:prstGeom>
-                  </pic:spPr>
-                </pic:pic>
-              </a:graphicData>
-            </a:graphic>
-          </wp:inline>
-        </w:drawing>
       </w:r>
     </w:p>
     <w:sectPr>

</xml_diff>